<commit_message>
GE: exponential summary for the management stream (exp after ln, GE-level content, quadratic equations in e^x, brace-style limits, relative-position table, economic applications); fix contents numbering
Co-Authored-By: Claude Opus 5.5 <noreply@anthropic.com>
Claude-Session: https://claude.ai/code/session_015WVgZKTbSWpZTjn6aZsqC9
</commit_message>
<xml_diff>
--- a/documents/ln_ge/molakhas_log_3as_ge.docx
+++ b/documents/ln_ge/molakhas_log_3as_ge.docx
@@ -162,17 +162,21 @@
                 </w:tcPr>
                 <w:p>
                   <w:pPr>
-                    <w:numPr>
-                      <w:ilvl w:val="0"/>
-                      <w:numId w:val="1001"/>
-                    </w:numPr>
                     <w:bidi/>
                   </w:pPr>
                   <w:r>
                     <w:rPr>
+                      <w:b/>
+                      <w:bCs/>
                       <w:rtl/>
                     </w:rPr>
-                    <w:t xml:space="preserve">المشتقات ، الدالة</w:t>
+                    <w:t xml:space="preserve">8.</w:t>
+                  </w:r>
+                  <w:r>
+                    <w:rPr>
+                      <w:rtl/>
+                    </w:rPr>
+                    <w:t xml:space="preserve"> المشتقات ، الدالة</w:t>
                   </w:r>
                   <w:r>
                     <w:rPr>
@@ -194,17 +198,21 @@
                 </w:p>
                 <w:p>
                   <w:pPr>
-                    <w:numPr>
-                      <w:ilvl w:val="0"/>
-                      <w:numId w:val="1001"/>
-                    </w:numPr>
                     <w:bidi/>
                   </w:pPr>
                   <w:r>
                     <w:rPr>
+                      <w:b/>
+                      <w:bCs/>
                       <w:rtl/>
                     </w:rPr>
-                    <w:t xml:space="preserve">دراسة الدالة</w:t>
+                    <w:t xml:space="preserve">9.</w:t>
+                  </w:r>
+                  <w:r>
+                    <w:rPr>
+                      <w:rtl/>
+                    </w:rPr>
+                    <w:t xml:space="preserve"> دراسة الدالة</w:t>
                   </w:r>
                   <w:r>
                     <w:rPr>
@@ -235,17 +243,21 @@
                 </w:p>
                 <w:p>
                   <w:pPr>
-                    <w:numPr>
-                      <w:ilvl w:val="0"/>
-                      <w:numId w:val="1001"/>
-                    </w:numPr>
                     <w:bidi/>
                   </w:pPr>
                   <w:r>
                     <w:rPr>
+                      <w:b/>
+                      <w:bCs/>
                       <w:rtl/>
                     </w:rPr>
-                    <w:t xml:space="preserve">اللوغاريتم العشري وذو الأساس</w:t>
+                    <w:t xml:space="preserve">10.</w:t>
+                  </w:r>
+                  <w:r>
+                    <w:rPr>
+                      <w:rtl/>
+                    </w:rPr>
+                    <w:t xml:space="preserve"> اللوغاريتم العشري وذو الأساس</w:t>
                   </w:r>
                   <w:r>
                     <w:rPr>
@@ -261,62 +273,78 @@
                 </w:p>
                 <w:p>
                   <w:pPr>
-                    <w:numPr>
-                      <w:ilvl w:val="0"/>
-                      <w:numId w:val="1001"/>
-                    </w:numPr>
                     <w:bidi/>
                   </w:pPr>
                   <w:r>
                     <w:rPr>
+                      <w:b/>
+                      <w:bCs/>
                       <w:rtl/>
                     </w:rPr>
-                    <w:t xml:space="preserve">تطبيقات اقتصادية</w:t>
+                    <w:t xml:space="preserve">11.</w:t>
+                  </w:r>
+                  <w:r>
+                    <w:rPr>
+                      <w:rtl/>
+                    </w:rPr>
+                    <w:t xml:space="preserve"> تطبيقات اقتصادية</w:t>
                   </w:r>
                 </w:p>
                 <w:p>
                   <w:pPr>
-                    <w:numPr>
-                      <w:ilvl w:val="0"/>
-                      <w:numId w:val="1001"/>
-                    </w:numPr>
                     <w:bidi/>
                   </w:pPr>
                   <w:r>
                     <w:rPr>
+                      <w:b/>
+                      <w:bCs/>
                       <w:rtl/>
                     </w:rPr>
-                    <w:t xml:space="preserve">أمثلة من بكالوريا تسيير واقتصاد</w:t>
+                    <w:t xml:space="preserve">12.</w:t>
+                  </w:r>
+                  <w:r>
+                    <w:rPr>
+                      <w:rtl/>
+                    </w:rPr>
+                    <w:t xml:space="preserve"> أمثلة من بكالوريا تسيير واقتصاد</w:t>
                   </w:r>
                 </w:p>
                 <w:p>
                   <w:pPr>
-                    <w:numPr>
-                      <w:ilvl w:val="0"/>
-                      <w:numId w:val="1001"/>
-                    </w:numPr>
                     <w:bidi/>
                   </w:pPr>
                   <w:r>
                     <w:rPr>
+                      <w:b/>
+                      <w:bCs/>
                       <w:rtl/>
                     </w:rPr>
-                    <w:t xml:space="preserve">مثال شامل من نمط البكالوريا</w:t>
+                    <w:t xml:space="preserve">13.</w:t>
+                  </w:r>
+                  <w:r>
+                    <w:rPr>
+                      <w:rtl/>
+                    </w:rPr>
+                    <w:t xml:space="preserve"> مثال شامل من نمط البكالوريا</w:t>
                   </w:r>
                 </w:p>
                 <w:p>
                   <w:pPr>
-                    <w:numPr>
-                      <w:ilvl w:val="0"/>
-                      <w:numId w:val="1001"/>
-                    </w:numPr>
                     <w:bidi/>
                   </w:pPr>
                   <w:r>
                     <w:rPr>
+                      <w:b/>
+                      <w:bCs/>
                       <w:rtl/>
                     </w:rPr>
-                    <w:t xml:space="preserve">خلاصة الطرائق</w:t>
+                    <w:t xml:space="preserve">14.</w:t>
+                  </w:r>
+                  <w:r>
+                    <w:rPr>
+                      <w:rtl/>
+                    </w:rPr>
+                    <w:t xml:space="preserve"> خلاصة الطرائق</w:t>
                   </w:r>
                 </w:p>
               </w:tc>
@@ -326,17 +354,21 @@
                 </w:tcPr>
                 <w:p>
                   <w:pPr>
-                    <w:numPr>
-                      <w:ilvl w:val="0"/>
-                      <w:numId w:val="1002"/>
-                    </w:numPr>
                     <w:bidi/>
                   </w:pPr>
                   <w:r>
                     <w:rPr>
+                      <w:b/>
+                      <w:bCs/>
                       <w:rtl/>
                     </w:rPr>
-                    <w:t xml:space="preserve">التعريف: الدالة الأصلية لمقلوب</w:t>
+                    <w:t xml:space="preserve">1.</w:t>
+                  </w:r>
+                  <w:r>
+                    <w:rPr>
+                      <w:rtl/>
+                    </w:rPr>
+                    <w:t xml:space="preserve"> التعريف: الدالة الأصلية لمقلوب</w:t>
                   </w:r>
                   <w:r>
                     <w:rPr>
@@ -352,62 +384,78 @@
                 </w:p>
                 <w:p>
                   <w:pPr>
-                    <w:numPr>
-                      <w:ilvl w:val="0"/>
-                      <w:numId w:val="1002"/>
-                    </w:numPr>
                     <w:bidi/>
                   </w:pPr>
                   <w:r>
                     <w:rPr>
+                      <w:b/>
+                      <w:bCs/>
                       <w:rtl/>
                     </w:rPr>
-                    <w:t xml:space="preserve">الخواص الجبرية</w:t>
+                    <w:t xml:space="preserve">2.</w:t>
+                  </w:r>
+                  <w:r>
+                    <w:rPr>
+                      <w:rtl/>
+                    </w:rPr>
+                    <w:t xml:space="preserve"> الخواص الجبرية</w:t>
                   </w:r>
                 </w:p>
                 <w:p>
                   <w:pPr>
-                    <w:numPr>
-                      <w:ilvl w:val="0"/>
-                      <w:numId w:val="1002"/>
-                    </w:numPr>
                     <w:bidi/>
                   </w:pPr>
                   <w:r>
                     <w:rPr>
+                      <w:b/>
+                      <w:bCs/>
                       <w:rtl/>
                     </w:rPr>
-                    <w:t xml:space="preserve">تبسيط عبارات لوغاريتمية</w:t>
+                    <w:t xml:space="preserve">3.</w:t>
+                  </w:r>
+                  <w:r>
+                    <w:rPr>
+                      <w:rtl/>
+                    </w:rPr>
+                    <w:t xml:space="preserve"> تبسيط عبارات لوغاريتمية</w:t>
                   </w:r>
                 </w:p>
                 <w:p>
                   <w:pPr>
-                    <w:numPr>
-                      <w:ilvl w:val="0"/>
-                      <w:numId w:val="1002"/>
-                    </w:numPr>
                     <w:bidi/>
                   </w:pPr>
                   <w:r>
                     <w:rPr>
+                      <w:b/>
+                      <w:bCs/>
                       <w:rtl/>
                     </w:rPr>
-                    <w:t xml:space="preserve">المعادلات اللوغاريتمية</w:t>
+                    <w:t xml:space="preserve">4.</w:t>
+                  </w:r>
+                  <w:r>
+                    <w:rPr>
+                      <w:rtl/>
+                    </w:rPr>
+                    <w:t xml:space="preserve"> المعادلات اللوغاريتمية</w:t>
                   </w:r>
                 </w:p>
                 <w:p>
                   <w:pPr>
-                    <w:numPr>
-                      <w:ilvl w:val="0"/>
-                      <w:numId w:val="1002"/>
-                    </w:numPr>
                     <w:bidi/>
                   </w:pPr>
                   <w:r>
                     <w:rPr>
+                      <w:b/>
+                      <w:bCs/>
                       <w:rtl/>
                     </w:rPr>
-                    <w:t xml:space="preserve">معادلات من الدرجة الثانية في</w:t>
+                    <w:t xml:space="preserve">5.</w:t>
+                  </w:r>
+                  <w:r>
+                    <w:rPr>
+                      <w:rtl/>
+                    </w:rPr>
+                    <w:t xml:space="preserve"> معادلات من الدرجة الثانية في</w:t>
                   </w:r>
                   <w:r>
                     <w:rPr>
@@ -429,32 +477,40 @@
                 </w:p>
                 <w:p>
                   <w:pPr>
-                    <w:numPr>
-                      <w:ilvl w:val="0"/>
-                      <w:numId w:val="1002"/>
-                    </w:numPr>
                     <w:bidi/>
                   </w:pPr>
                   <w:r>
                     <w:rPr>
+                      <w:b/>
+                      <w:bCs/>
                       <w:rtl/>
                     </w:rPr>
-                    <w:t xml:space="preserve">المتراجحات اللوغاريتمية</w:t>
+                    <w:t xml:space="preserve">6.</w:t>
+                  </w:r>
+                  <w:r>
+                    <w:rPr>
+                      <w:rtl/>
+                    </w:rPr>
+                    <w:t xml:space="preserve"> المتراجحات اللوغاريتمية</w:t>
                   </w:r>
                 </w:p>
                 <w:p>
                   <w:pPr>
-                    <w:numPr>
-                      <w:ilvl w:val="0"/>
-                      <w:numId w:val="1002"/>
-                    </w:numPr>
                     <w:bidi/>
                   </w:pPr>
                   <w:r>
                     <w:rPr>
+                      <w:b/>
+                      <w:bCs/>
                       <w:rtl/>
                     </w:rPr>
-                    <w:t xml:space="preserve">النهايات والنهايات الشهيرة</w:t>
+                    <w:t xml:space="preserve">7.</w:t>
+                  </w:r>
+                  <w:r>
+                    <w:rPr>
+                      <w:rtl/>
+                    </w:rPr>
+                    <w:t xml:space="preserve"> النهايات والنهايات الشهيرة</w:t>
                   </w:r>
                 </w:p>
               </w:tc>
@@ -1259,7 +1315,7 @@
             <w:pPr>
               <w:numPr>
                 <w:ilvl w:val="0"/>
-                <w:numId w:val="1003"/>
+                <w:numId w:val="1001"/>
               </w:numPr>
               <w:bidi/>
             </w:pPr>
@@ -1403,7 +1459,7 @@
             <w:pPr>
               <w:numPr>
                 <w:ilvl w:val="0"/>
-                <w:numId w:val="1003"/>
+                <w:numId w:val="1001"/>
               </w:numPr>
               <w:bidi/>
             </w:pPr>
@@ -1607,7 +1663,7 @@
             <w:pPr>
               <w:numPr>
                 <w:ilvl w:val="0"/>
-                <w:numId w:val="1003"/>
+                <w:numId w:val="1001"/>
               </w:numPr>
               <w:bidi/>
             </w:pPr>
@@ -1730,7 +1786,7 @@
             <w:pPr>
               <w:numPr>
                 <w:ilvl w:val="0"/>
-                <w:numId w:val="1003"/>
+                <w:numId w:val="1001"/>
               </w:numPr>
               <w:bidi/>
             </w:pPr>
@@ -4570,7 +4626,7 @@
             <w:pPr>
               <w:numPr>
                 <w:ilvl w:val="0"/>
-                <w:numId w:val="1004"/>
+                <w:numId w:val="1002"/>
               </w:numPr>
               <w:bidi/>
             </w:pPr>
@@ -4700,7 +4756,7 @@
             <w:pPr>
               <w:numPr>
                 <w:ilvl w:val="0"/>
-                <w:numId w:val="1004"/>
+                <w:numId w:val="1002"/>
               </w:numPr>
               <w:bidi/>
             </w:pPr>
@@ -4854,7 +4910,7 @@
             <w:pPr>
               <w:numPr>
                 <w:ilvl w:val="0"/>
-                <w:numId w:val="1004"/>
+                <w:numId w:val="1002"/>
               </w:numPr>
               <w:bidi/>
             </w:pPr>
@@ -5023,7 +5079,7 @@
             <w:pPr>
               <w:numPr>
                 <w:ilvl w:val="0"/>
-                <w:numId w:val="1004"/>
+                <w:numId w:val="1002"/>
               </w:numPr>
               <w:bidi/>
             </w:pPr>
@@ -5251,7 +5307,7 @@
             <w:pPr>
               <w:numPr>
                 <w:ilvl w:val="0"/>
-                <w:numId w:val="1005"/>
+                <w:numId w:val="1003"/>
               </w:numPr>
               <w:bidi/>
             </w:pPr>
@@ -5492,7 +5548,7 @@
             <w:pPr>
               <w:numPr>
                 <w:ilvl w:val="0"/>
-                <w:numId w:val="1005"/>
+                <w:numId w:val="1003"/>
               </w:numPr>
               <w:bidi/>
             </w:pPr>
@@ -5667,7 +5723,7 @@
             <w:pPr>
               <w:numPr>
                 <w:ilvl w:val="0"/>
-                <w:numId w:val="1005"/>
+                <w:numId w:val="1003"/>
               </w:numPr>
               <w:bidi/>
             </w:pPr>
@@ -5945,7 +6001,7 @@
             <w:pPr>
               <w:numPr>
                 <w:ilvl w:val="0"/>
-                <w:numId w:val="1006"/>
+                <w:numId w:val="1004"/>
               </w:numPr>
               <w:bidi/>
             </w:pPr>
@@ -6015,7 +6071,7 @@
             <w:pPr>
               <w:numPr>
                 <w:ilvl w:val="0"/>
-                <w:numId w:val="1006"/>
+                <w:numId w:val="1004"/>
               </w:numPr>
               <w:bidi/>
             </w:pPr>
@@ -6221,7 +6277,7 @@
             <w:pPr>
               <w:numPr>
                 <w:ilvl w:val="0"/>
-                <w:numId w:val="1006"/>
+                <w:numId w:val="1004"/>
               </w:numPr>
               <w:bidi/>
             </w:pPr>
@@ -9212,7 +9268,7 @@
             <w:pPr>
               <w:numPr>
                 <w:ilvl w:val="0"/>
-                <w:numId w:val="1007"/>
+                <w:numId w:val="1005"/>
               </w:numPr>
               <w:bidi/>
             </w:pPr>
@@ -9374,7 +9430,7 @@
             <w:pPr>
               <w:numPr>
                 <w:ilvl w:val="0"/>
-                <w:numId w:val="1007"/>
+                <w:numId w:val="1005"/>
               </w:numPr>
               <w:bidi/>
             </w:pPr>
@@ -9535,7 +9591,7 @@
             <w:pPr>
               <w:numPr>
                 <w:ilvl w:val="0"/>
-                <w:numId w:val="1007"/>
+                <w:numId w:val="1005"/>
               </w:numPr>
               <w:bidi/>
             </w:pPr>
@@ -18855,7 +18911,7 @@
             <w:pPr>
               <w:numPr>
                 <w:ilvl w:val="0"/>
-                <w:numId w:val="1008"/>
+                <w:numId w:val="1006"/>
               </w:numPr>
               <w:bidi/>
             </w:pPr>
@@ -19007,7 +19063,7 @@
             <w:pPr>
               <w:numPr>
                 <w:ilvl w:val="0"/>
-                <w:numId w:val="1008"/>
+                <w:numId w:val="1006"/>
               </w:numPr>
               <w:bidi/>
             </w:pPr>
@@ -19192,7 +19248,7 @@
             <w:pPr>
               <w:numPr>
                 <w:ilvl w:val="0"/>
-                <w:numId w:val="1008"/>
+                <w:numId w:val="1006"/>
               </w:numPr>
               <w:bidi/>
             </w:pPr>
@@ -21449,7 +21505,7 @@
             <w:pPr>
               <w:numPr>
                 <w:ilvl w:val="0"/>
-                <w:numId w:val="1009"/>
+                <w:numId w:val="1007"/>
               </w:numPr>
               <w:bidi/>
             </w:pPr>
@@ -21549,7 +21605,7 @@
             <w:pPr>
               <w:numPr>
                 <w:ilvl w:val="0"/>
-                <w:numId w:val="1009"/>
+                <w:numId w:val="1007"/>
               </w:numPr>
               <w:bidi/>
             </w:pPr>
@@ -21626,7 +21682,7 @@
             <w:pPr>
               <w:numPr>
                 <w:ilvl w:val="0"/>
-                <w:numId w:val="1009"/>
+                <w:numId w:val="1007"/>
               </w:numPr>
               <w:bidi/>
             </w:pPr>
@@ -21787,7 +21843,7 @@
             <w:pPr>
               <w:numPr>
                 <w:ilvl w:val="0"/>
-                <w:numId w:val="1009"/>
+                <w:numId w:val="1007"/>
               </w:numPr>
               <w:bidi/>
             </w:pPr>
@@ -21997,7 +22053,7 @@
             <w:pPr>
               <w:numPr>
                 <w:ilvl w:val="0"/>
-                <w:numId w:val="1010"/>
+                <w:numId w:val="1008"/>
               </w:numPr>
               <w:bidi/>
             </w:pPr>
@@ -22284,7 +22340,7 @@
             <w:pPr>
               <w:numPr>
                 <w:ilvl w:val="0"/>
-                <w:numId w:val="1010"/>
+                <w:numId w:val="1008"/>
               </w:numPr>
               <w:bidi/>
             </w:pPr>
@@ -22825,7 +22881,7 @@
             <w:pPr>
               <w:numPr>
                 <w:ilvl w:val="0"/>
-                <w:numId w:val="1011"/>
+                <w:numId w:val="1009"/>
               </w:numPr>
               <w:bidi/>
             </w:pPr>
@@ -23081,7 +23137,7 @@
             <w:pPr>
               <w:numPr>
                 <w:ilvl w:val="0"/>
-                <w:numId w:val="1011"/>
+                <w:numId w:val="1009"/>
               </w:numPr>
               <w:bidi/>
             </w:pPr>
@@ -36312,6 +36368,82 @@
       </w:pPr>
     </w:lvl>
   </w:abstractNum>
+  <w:abstractNum w:abstractNumId="991">
+    <w:nsid w:val="A991"/>
+    <w:multiLevelType w:val="multilevel"/>
+    <w:lvl w:ilvl="0">
+      <w:numFmt w:val="bullet"/>
+      <w:lvlText w:val="•"/>
+      <w:lvlJc w:val="left"/>
+      <w:pPr>
+        <w:ind w:left="720" w:hanging="480"/>
+      </w:pPr>
+    </w:lvl>
+    <w:lvl w:ilvl="1">
+      <w:numFmt w:val="bullet"/>
+      <w:lvlText w:val="–"/>
+      <w:lvlJc w:val="left"/>
+      <w:pPr>
+        <w:ind w:left="1440" w:hanging="480"/>
+      </w:pPr>
+    </w:lvl>
+    <w:lvl w:ilvl="2">
+      <w:numFmt w:val="bullet"/>
+      <w:lvlText w:val="•"/>
+      <w:lvlJc w:val="left"/>
+      <w:pPr>
+        <w:ind w:left="2160" w:hanging="480"/>
+      </w:pPr>
+    </w:lvl>
+    <w:lvl w:ilvl="3">
+      <w:numFmt w:val="bullet"/>
+      <w:lvlText w:val="–"/>
+      <w:lvlJc w:val="left"/>
+      <w:pPr>
+        <w:ind w:left="2880" w:hanging="480"/>
+      </w:pPr>
+    </w:lvl>
+    <w:lvl w:ilvl="4">
+      <w:numFmt w:val="bullet"/>
+      <w:lvlText w:val="•"/>
+      <w:lvlJc w:val="left"/>
+      <w:pPr>
+        <w:ind w:left="3600" w:hanging="480"/>
+      </w:pPr>
+    </w:lvl>
+    <w:lvl w:ilvl="5">
+      <w:numFmt w:val="bullet"/>
+      <w:lvlText w:val="–"/>
+      <w:lvlJc w:val="left"/>
+      <w:pPr>
+        <w:ind w:left="4320" w:hanging="480"/>
+      </w:pPr>
+    </w:lvl>
+    <w:lvl w:ilvl="6">
+      <w:numFmt w:val="bullet"/>
+      <w:lvlText w:val="•"/>
+      <w:lvlJc w:val="left"/>
+      <w:pPr>
+        <w:ind w:left="5040" w:hanging="480"/>
+      </w:pPr>
+    </w:lvl>
+    <w:lvl w:ilvl="7">
+      <w:numFmt w:val="bullet"/>
+      <w:lvlText w:val="–"/>
+      <w:lvlJc w:val="left"/>
+      <w:pPr>
+        <w:ind w:left="5760" w:hanging="480"/>
+      </w:pPr>
+    </w:lvl>
+    <w:lvl w:ilvl="8">
+      <w:numFmt w:val="bullet"/>
+      <w:lvlText w:val="•"/>
+      <w:lvlJc w:val="left"/>
+      <w:pPr>
+        <w:ind w:left="6480" w:hanging="480"/>
+      </w:pPr>
+    </w:lvl>
+  </w:abstractNum>
   <w:abstractNum w:abstractNumId="99201">
     <w:nsid w:val="A99201"/>
     <w:multiLevelType w:val="multilevel"/>
@@ -36397,86 +36529,19 @@
       </w:pPr>
     </w:lvl>
   </w:abstractNum>
-  <w:abstractNum w:abstractNumId="991">
-    <w:nsid w:val="A991"/>
-    <w:multiLevelType w:val="multilevel"/>
-    <w:lvl w:ilvl="0">
-      <w:numFmt w:val="bullet"/>
-      <w:lvlText w:val="•"/>
-      <w:lvlJc w:val="left"/>
-      <w:pPr>
-        <w:ind w:left="720" w:hanging="480"/>
-      </w:pPr>
-    </w:lvl>
-    <w:lvl w:ilvl="1">
-      <w:numFmt w:val="bullet"/>
-      <w:lvlText w:val="–"/>
-      <w:lvlJc w:val="left"/>
-      <w:pPr>
-        <w:ind w:left="1440" w:hanging="480"/>
-      </w:pPr>
-    </w:lvl>
-    <w:lvl w:ilvl="2">
-      <w:numFmt w:val="bullet"/>
-      <w:lvlText w:val="•"/>
-      <w:lvlJc w:val="left"/>
-      <w:pPr>
-        <w:ind w:left="2160" w:hanging="480"/>
-      </w:pPr>
-    </w:lvl>
-    <w:lvl w:ilvl="3">
-      <w:numFmt w:val="bullet"/>
-      <w:lvlText w:val="–"/>
-      <w:lvlJc w:val="left"/>
-      <w:pPr>
-        <w:ind w:left="2880" w:hanging="480"/>
-      </w:pPr>
-    </w:lvl>
-    <w:lvl w:ilvl="4">
-      <w:numFmt w:val="bullet"/>
-      <w:lvlText w:val="•"/>
-      <w:lvlJc w:val="left"/>
-      <w:pPr>
-        <w:ind w:left="3600" w:hanging="480"/>
-      </w:pPr>
-    </w:lvl>
-    <w:lvl w:ilvl="5">
-      <w:numFmt w:val="bullet"/>
-      <w:lvlText w:val="–"/>
-      <w:lvlJc w:val="left"/>
-      <w:pPr>
-        <w:ind w:left="4320" w:hanging="480"/>
-      </w:pPr>
-    </w:lvl>
-    <w:lvl w:ilvl="6">
-      <w:numFmt w:val="bullet"/>
-      <w:lvlText w:val="•"/>
-      <w:lvlJc w:val="left"/>
-      <w:pPr>
-        <w:ind w:left="5040" w:hanging="480"/>
-      </w:pPr>
-    </w:lvl>
-    <w:lvl w:ilvl="7">
-      <w:numFmt w:val="bullet"/>
-      <w:lvlText w:val="–"/>
-      <w:lvlJc w:val="left"/>
-      <w:pPr>
-        <w:ind w:left="5760" w:hanging="480"/>
-      </w:pPr>
-    </w:lvl>
-    <w:lvl w:ilvl="8">
-      <w:numFmt w:val="bullet"/>
-      <w:lvlText w:val="•"/>
-      <w:lvlJc w:val="left"/>
-      <w:pPr>
-        <w:ind w:left="6480" w:hanging="480"/>
-      </w:pPr>
-    </w:lvl>
-  </w:abstractNum>
   <w:num w:numId="1000">
     <w:abstractNumId w:val="990"/>
   </w:num>
   <w:num w:numId="1001">
+    <w:abstractNumId w:val="991"/>
+  </w:num>
+  <w:num w:numId="1002">
+    <w:abstractNumId w:val="991"/>
+  </w:num>
+  <w:num w:numId="1003">
+    <w:abstractNumId w:val="991"/>
+  </w:num>
+  <w:num w:numId="1004">
     <w:abstractNumId w:val="99201"/>
     <w:lvlOverride w:ilvl="0">
       <w:startOverride w:val="1"/>
@@ -36506,7 +36571,7 @@
       <w:startOverride w:val="1"/>
     </w:lvlOverride>
   </w:num>
-  <w:num w:numId="1002">
+  <w:num w:numId="1005">
     <w:abstractNumId w:val="99201"/>
     <w:lvlOverride w:ilvl="0">
       <w:startOverride w:val="1"/>
@@ -36536,85 +36601,16 @@
       <w:startOverride w:val="1"/>
     </w:lvlOverride>
   </w:num>
-  <w:num w:numId="1003">
+  <w:num w:numId="1006">
     <w:abstractNumId w:val="991"/>
   </w:num>
-  <w:num w:numId="1004">
+  <w:num w:numId="1007">
     <w:abstractNumId w:val="991"/>
-  </w:num>
-  <w:num w:numId="1005">
-    <w:abstractNumId w:val="991"/>
-  </w:num>
-  <w:num w:numId="1006">
-    <w:abstractNumId w:val="99201"/>
-    <w:lvlOverride w:ilvl="0">
-      <w:startOverride w:val="1"/>
-    </w:lvlOverride>
-    <w:lvlOverride w:ilvl="1">
-      <w:startOverride w:val="1"/>
-    </w:lvlOverride>
-    <w:lvlOverride w:ilvl="2">
-      <w:startOverride w:val="1"/>
-    </w:lvlOverride>
-    <w:lvlOverride w:ilvl="3">
-      <w:startOverride w:val="1"/>
-    </w:lvlOverride>
-    <w:lvlOverride w:ilvl="4">
-      <w:startOverride w:val="1"/>
-    </w:lvlOverride>
-    <w:lvlOverride w:ilvl="5">
-      <w:startOverride w:val="1"/>
-    </w:lvlOverride>
-    <w:lvlOverride w:ilvl="6">
-      <w:startOverride w:val="1"/>
-    </w:lvlOverride>
-    <w:lvlOverride w:ilvl="7">
-      <w:startOverride w:val="1"/>
-    </w:lvlOverride>
-    <w:lvlOverride w:ilvl="8">
-      <w:startOverride w:val="1"/>
-    </w:lvlOverride>
-  </w:num>
-  <w:num w:numId="1007">
-    <w:abstractNumId w:val="99201"/>
-    <w:lvlOverride w:ilvl="0">
-      <w:startOverride w:val="1"/>
-    </w:lvlOverride>
-    <w:lvlOverride w:ilvl="1">
-      <w:startOverride w:val="1"/>
-    </w:lvlOverride>
-    <w:lvlOverride w:ilvl="2">
-      <w:startOverride w:val="1"/>
-    </w:lvlOverride>
-    <w:lvlOverride w:ilvl="3">
-      <w:startOverride w:val="1"/>
-    </w:lvlOverride>
-    <w:lvlOverride w:ilvl="4">
-      <w:startOverride w:val="1"/>
-    </w:lvlOverride>
-    <w:lvlOverride w:ilvl="5">
-      <w:startOverride w:val="1"/>
-    </w:lvlOverride>
-    <w:lvlOverride w:ilvl="6">
-      <w:startOverride w:val="1"/>
-    </w:lvlOverride>
-    <w:lvlOverride w:ilvl="7">
-      <w:startOverride w:val="1"/>
-    </w:lvlOverride>
-    <w:lvlOverride w:ilvl="8">
-      <w:startOverride w:val="1"/>
-    </w:lvlOverride>
   </w:num>
   <w:num w:numId="1008">
     <w:abstractNumId w:val="991"/>
   </w:num>
   <w:num w:numId="1009">
-    <w:abstractNumId w:val="991"/>
-  </w:num>
-  <w:num w:numId="1010">
-    <w:abstractNumId w:val="991"/>
-  </w:num>
-  <w:num w:numId="1011">
     <w:abstractNumId w:val="991"/>
   </w:num>
 </w:numbering>

</xml_diff>